<commit_message>
doc file of readme
</commit_message>
<xml_diff>
--- a/Readme for EA project 35752.docx
+++ b/Readme for EA project 35752.docx
@@ -788,13 +788,8 @@
     </w:p>
     <w:p>
       <w:r>
-        <w:t xml:space="preserve">Event rainfall AEP based on XML </w:t>
+        <w:t>Event rainfall AEP based on XML files</w:t>
       </w:r>
-      <w:proofErr w:type="gramStart"/>
-      <w:r>
-        <w:t>files</w:t>
-      </w:r>
-      <w:proofErr w:type="gramEnd"/>
     </w:p>
     <w:tbl>
       <w:tblPr>
@@ -2985,13 +2980,8 @@
     </w:p>
     <w:p>
       <w:r>
-        <w:t xml:space="preserve">Lookup tables for 1 in x AEP to derive event </w:t>
+        <w:t>Lookup tables for 1 in x AEP to derive event AEPs</w:t>
       </w:r>
-      <w:proofErr w:type="gramStart"/>
-      <w:r>
-        <w:t>AEPs</w:t>
-      </w:r>
-      <w:proofErr w:type="gramEnd"/>
     </w:p>
     <w:tbl>
       <w:tblPr>
@@ -4192,12 +4182,10 @@
         <w:t xml:space="preserve">data for each COSMOS-UK station ranked for each </w:t>
       </w:r>
       <w:proofErr w:type="spellStart"/>
-      <w:proofErr w:type="gramStart"/>
       <w:r>
         <w:t>monthquarter</w:t>
       </w:r>
       <w:proofErr w:type="spellEnd"/>
-      <w:proofErr w:type="gramEnd"/>
     </w:p>
     <w:tbl>
       <w:tblPr>
@@ -4541,13 +4529,8 @@
     </w:p>
     <w:p>
       <w:r>
-        <w:t xml:space="preserve">Details for all key flood characteristics aligned to key </w:t>
+        <w:t>Details for all key flood characteristics aligned to key events</w:t>
       </w:r>
-      <w:proofErr w:type="gramStart"/>
-      <w:r>
-        <w:t>events</w:t>
-      </w:r>
-      <w:proofErr w:type="gramEnd"/>
     </w:p>
     <w:tbl>
       <w:tblPr>
@@ -5308,13 +5291,8 @@
             <w:hideMark/>
           </w:tcPr>
           <w:p>
-            <w:proofErr w:type="gramStart"/>
-            <w:r>
-              <w:t>6 hour</w:t>
-            </w:r>
-            <w:proofErr w:type="gramEnd"/>
-            <w:r>
-              <w:t xml:space="preserve"> depth of rainfall from nearest raingauge using FEH22 analysis (mm)</w:t>
+            <w:r>
+              <w:t>6 hour depth of rainfall from nearest raingauge using FEH22 analysis (mm)</w:t>
             </w:r>
           </w:p>
         </w:tc>
@@ -5355,15 +5333,7 @@
           </w:tcPr>
           <w:p>
             <w:r>
-              <w:t xml:space="preserve">1 in x AEP for </w:t>
-            </w:r>
-            <w:proofErr w:type="gramStart"/>
-            <w:r>
-              <w:t>6 hour</w:t>
-            </w:r>
-            <w:proofErr w:type="gramEnd"/>
-            <w:r>
-              <w:t xml:space="preserve"> depth of rainfall from nearest raingauge using FEH22 analysis</w:t>
+              <w:t>1 in x AEP for 6 hour depth of rainfall from nearest raingauge using FEH22 analysis</w:t>
             </w:r>
           </w:p>
         </w:tc>
@@ -5401,13 +5371,8 @@
             <w:hideMark/>
           </w:tcPr>
           <w:p>
-            <w:proofErr w:type="gramStart"/>
-            <w:r>
-              <w:t>30 day</w:t>
-            </w:r>
-            <w:proofErr w:type="gramEnd"/>
-            <w:r>
-              <w:t xml:space="preserve"> rainfall accumulation (mm)</w:t>
+            <w:r>
+              <w:t>30 day rainfall accumulation (mm)</w:t>
             </w:r>
           </w:p>
         </w:tc>
@@ -5484,13 +5449,8 @@
             <w:hideMark/>
           </w:tcPr>
           <w:p>
-            <w:proofErr w:type="gramStart"/>
-            <w:r>
-              <w:t>60 day</w:t>
-            </w:r>
-            <w:proofErr w:type="gramEnd"/>
-            <w:r>
-              <w:t xml:space="preserve"> rainfall accumulation (mm)</w:t>
+            <w:r>
+              <w:t>60 day rainfall accumulation (mm)</w:t>
             </w:r>
           </w:p>
         </w:tc>
@@ -5567,13 +5527,8 @@
             <w:hideMark/>
           </w:tcPr>
           <w:p>
-            <w:proofErr w:type="gramStart"/>
-            <w:r>
-              <w:t>90 day</w:t>
-            </w:r>
-            <w:proofErr w:type="gramEnd"/>
-            <w:r>
-              <w:t xml:space="preserve"> rainfall accumulation (mm)</w:t>
+            <w:r>
+              <w:t>90 day rainfall accumulation (mm)</w:t>
             </w:r>
           </w:p>
         </w:tc>
@@ -5650,13 +5605,8 @@
             <w:hideMark/>
           </w:tcPr>
           <w:p>
-            <w:proofErr w:type="gramStart"/>
-            <w:r>
-              <w:t>180 day</w:t>
-            </w:r>
-            <w:proofErr w:type="gramEnd"/>
-            <w:r>
-              <w:t xml:space="preserve"> rainfall accumulation (mm)</w:t>
+            <w:r>
+              <w:t>180 day rainfall accumulation (mm)</w:t>
             </w:r>
           </w:p>
         </w:tc>
@@ -11022,13 +10972,8 @@
       </w:r>
     </w:p>
     <w:p>
-      <w:proofErr w:type="gramStart"/>
       <w:r>
-        <w:t>Tidy-format</w:t>
-      </w:r>
-      <w:proofErr w:type="gramEnd"/>
-      <w:r>
-        <w:t xml:space="preserve"> of number of stations with </w:t>
+        <w:t xml:space="preserve">Tidy-format of number of stations with </w:t>
       </w:r>
       <w:proofErr w:type="spellStart"/>
       <w:r>
@@ -13077,13 +13022,8 @@
     </w:p>
     <w:p>
       <w:r>
-        <w:t xml:space="preserve">AMAX values extracted from 15-minute flow data, one station per row, one year per </w:t>
+        <w:t>AMAX values extracted from 15-minute flow data, one station per row, one year per column</w:t>
       </w:r>
-      <w:proofErr w:type="gramStart"/>
-      <w:r>
-        <w:t>column</w:t>
-      </w:r>
-      <w:proofErr w:type="gramEnd"/>
     </w:p>
     <w:tbl>
       <w:tblPr>
@@ -14083,13 +14023,8 @@
     </w:p>
     <w:p>
       <w:r>
-        <w:t xml:space="preserve">WINFAP data on NRFA stations based on </w:t>
+        <w:t>WINFAP data on NRFA stations based on ESS</w:t>
       </w:r>
-      <w:proofErr w:type="gramStart"/>
-      <w:r>
-        <w:t>ESS</w:t>
-      </w:r>
-      <w:proofErr w:type="gramEnd"/>
     </w:p>
     <w:tbl>
       <w:tblPr>
@@ -15443,42 +15378,54 @@
                 <w:rFonts w:cstheme="minorHAnsi"/>
               </w:rPr>
             </w:pPr>
-            <w:proofErr w:type="gramStart"/>
             <w:r>
               <w:rPr>
                 <w:rFonts w:cstheme="minorHAnsi"/>
                 <w:color w:val="000000"/>
               </w:rPr>
-              <w:t>YES</w:t>
-            </w:r>
-            <w:proofErr w:type="gramEnd"/>
+              <w:t>YES if already known to be in the stations flow AMAX series</w:t>
+            </w:r>
+          </w:p>
+        </w:tc>
+        <w:tc>
+          <w:tcPr>
+            <w:tcW w:w="2522" w:type="dxa"/>
+          </w:tcPr>
+          <w:p>
+            <w:r>
+              <w:t>Yes/No</w:t>
+            </w:r>
+          </w:p>
+        </w:tc>
+      </w:tr>
+      <w:tr>
+        <w:trPr>
+          <w:trHeight w:val="300"/>
+        </w:trPr>
+        <w:tc>
+          <w:tcPr>
+            <w:tcW w:w="1696" w:type="dxa"/>
+            <w:noWrap/>
+            <w:vAlign w:val="bottom"/>
+          </w:tcPr>
+          <w:p>
+            <w:pPr>
+              <w:rPr>
+                <w:rFonts w:cstheme="minorHAnsi"/>
+              </w:rPr>
+            </w:pPr>
             <w:r>
               <w:rPr>
                 <w:rFonts w:cstheme="minorHAnsi"/>
                 <w:color w:val="000000"/>
               </w:rPr>
-              <w:t xml:space="preserve"> if already known to be in the stations flow AMAX series</w:t>
-            </w:r>
-          </w:p>
-        </w:tc>
-        <w:tc>
-          <w:tcPr>
-            <w:tcW w:w="2522" w:type="dxa"/>
-          </w:tcPr>
-          <w:p>
-            <w:r>
-              <w:t>Yes/No</w:t>
-            </w:r>
-          </w:p>
-        </w:tc>
-      </w:tr>
-      <w:tr>
-        <w:trPr>
-          <w:trHeight w:val="300"/>
-        </w:trPr>
-        <w:tc>
-          <w:tcPr>
-            <w:tcW w:w="1696" w:type="dxa"/>
+              <w:t>In POT series</w:t>
+            </w:r>
+          </w:p>
+        </w:tc>
+        <w:tc>
+          <w:tcPr>
+            <w:tcW w:w="5410" w:type="dxa"/>
             <w:noWrap/>
             <w:vAlign w:val="bottom"/>
           </w:tcPr>
@@ -15493,13 +15440,28 @@
                 <w:rFonts w:cstheme="minorHAnsi"/>
                 <w:color w:val="000000"/>
               </w:rPr>
-              <w:t>In POT series</w:t>
-            </w:r>
-          </w:p>
-        </w:tc>
-        <w:tc>
-          <w:tcPr>
-            <w:tcW w:w="5410" w:type="dxa"/>
+              <w:t>YES if already known to be in the stations flow POT series (if such series exists)</w:t>
+            </w:r>
+          </w:p>
+        </w:tc>
+        <w:tc>
+          <w:tcPr>
+            <w:tcW w:w="2522" w:type="dxa"/>
+          </w:tcPr>
+          <w:p>
+            <w:r>
+              <w:t>Yes/No</w:t>
+            </w:r>
+          </w:p>
+        </w:tc>
+      </w:tr>
+      <w:tr>
+        <w:trPr>
+          <w:trHeight w:val="300"/>
+        </w:trPr>
+        <w:tc>
+          <w:tcPr>
+            <w:tcW w:w="1696" w:type="dxa"/>
             <w:noWrap/>
             <w:vAlign w:val="bottom"/>
           </w:tcPr>
@@ -15509,21 +15471,33 @@
                 <w:rFonts w:cstheme="minorHAnsi"/>
               </w:rPr>
             </w:pPr>
-            <w:proofErr w:type="gramStart"/>
             <w:r>
               <w:rPr>
                 <w:rFonts w:cstheme="minorHAnsi"/>
                 <w:color w:val="000000"/>
               </w:rPr>
-              <w:t>YES</w:t>
-            </w:r>
-            <w:proofErr w:type="gramEnd"/>
+              <w:t>Rank as AMAX</w:t>
+            </w:r>
+          </w:p>
+        </w:tc>
+        <w:tc>
+          <w:tcPr>
+            <w:tcW w:w="5410" w:type="dxa"/>
+            <w:noWrap/>
+            <w:vAlign w:val="bottom"/>
+          </w:tcPr>
+          <w:p>
+            <w:pPr>
+              <w:rPr>
+                <w:rFonts w:cstheme="minorHAnsi"/>
+              </w:rPr>
+            </w:pPr>
             <w:r>
               <w:rPr>
                 <w:rFonts w:cstheme="minorHAnsi"/>
                 <w:color w:val="000000"/>
               </w:rPr>
-              <w:t xml:space="preserve"> if already known to be in the stations flow POT series (if such series exists)</w:t>
+              <w:t>Rank compared to AMAX series</w:t>
             </w:r>
           </w:p>
         </w:tc>
@@ -15533,7 +15507,7 @@
           </w:tcPr>
           <w:p>
             <w:r>
-              <w:t>Yes/No</w:t>
+              <w:t>Integer</w:t>
             </w:r>
           </w:p>
         </w:tc>
@@ -15559,7 +15533,7 @@
                 <w:rFonts w:cstheme="minorHAnsi"/>
                 <w:color w:val="000000"/>
               </w:rPr>
-              <w:t>Rank as AMAX</w:t>
+              <w:t>Rank as POT</w:t>
             </w:r>
           </w:p>
         </w:tc>
@@ -15580,7 +15554,7 @@
                 <w:rFonts w:cstheme="minorHAnsi"/>
                 <w:color w:val="000000"/>
               </w:rPr>
-              <w:t>Rank compared to AMAX series</w:t>
+              <w:t>Rank compared to POT series</w:t>
             </w:r>
           </w:p>
         </w:tc>
@@ -15616,7 +15590,7 @@
                 <w:rFonts w:cstheme="minorHAnsi"/>
                 <w:color w:val="000000"/>
               </w:rPr>
-              <w:t>Rank as POT</w:t>
+              <w:t>Method</w:t>
             </w:r>
           </w:p>
         </w:tc>
@@ -15637,7 +15611,7 @@
                 <w:rFonts w:cstheme="minorHAnsi"/>
                 <w:color w:val="000000"/>
               </w:rPr>
-              <w:t>Rank compared to POT series</w:t>
+              <w:t>Preferred method: FEH-ESS is enhanced single site analysis.</w:t>
             </w:r>
           </w:p>
         </w:tc>
@@ -15647,7 +15621,7 @@
           </w:tcPr>
           <w:p>
             <w:r>
-              <w:t>Integer</w:t>
+              <w:t>AMAX-ESS or AMAX-Site</w:t>
             </w:r>
           </w:p>
         </w:tc>
@@ -15673,7 +15647,7 @@
                 <w:rFonts w:cstheme="minorHAnsi"/>
                 <w:color w:val="000000"/>
               </w:rPr>
-              <w:t>Method</w:t>
+              <w:t>Confidence Interval</w:t>
             </w:r>
           </w:p>
         </w:tc>
@@ -15694,7 +15668,7 @@
                 <w:rFonts w:cstheme="minorHAnsi"/>
                 <w:color w:val="000000"/>
               </w:rPr>
-              <w:t>Preferred method: FEH-ESS is enhanced single site analysis.</w:t>
+              <w:t>Confidence interval for preferred AEP</w:t>
             </w:r>
           </w:p>
         </w:tc>
@@ -15704,72 +15678,7 @@
           </w:tcPr>
           <w:p>
             <w:r>
-              <w:t>AMAX-ESS or AMAX-Site</w:t>
-            </w:r>
-          </w:p>
-        </w:tc>
-      </w:tr>
-      <w:tr>
-        <w:trPr>
-          <w:trHeight w:val="300"/>
-        </w:trPr>
-        <w:tc>
-          <w:tcPr>
-            <w:tcW w:w="1696" w:type="dxa"/>
-            <w:noWrap/>
-            <w:vAlign w:val="bottom"/>
-          </w:tcPr>
-          <w:p>
-            <w:pPr>
-              <w:rPr>
-                <w:rFonts w:cstheme="minorHAnsi"/>
-              </w:rPr>
-            </w:pPr>
-            <w:r>
-              <w:rPr>
-                <w:rFonts w:cstheme="minorHAnsi"/>
-                <w:color w:val="000000"/>
-              </w:rPr>
-              <w:t>Confidence Interval</w:t>
-            </w:r>
-          </w:p>
-        </w:tc>
-        <w:tc>
-          <w:tcPr>
-            <w:tcW w:w="5410" w:type="dxa"/>
-            <w:noWrap/>
-            <w:vAlign w:val="bottom"/>
-          </w:tcPr>
-          <w:p>
-            <w:pPr>
-              <w:rPr>
-                <w:rFonts w:cstheme="minorHAnsi"/>
-              </w:rPr>
-            </w:pPr>
-            <w:r>
-              <w:rPr>
-                <w:rFonts w:cstheme="minorHAnsi"/>
-                <w:color w:val="000000"/>
-              </w:rPr>
-              <w:t>Confidence interval for preferred AEP</w:t>
-            </w:r>
-          </w:p>
-        </w:tc>
-        <w:tc>
-          <w:tcPr>
-            <w:tcW w:w="2522" w:type="dxa"/>
-          </w:tcPr>
-          <w:p>
-            <w:r>
-              <w:t>“</w:t>
-            </w:r>
-            <w:proofErr w:type="gramStart"/>
-            <w:r>
-              <w:t>xx</w:t>
-            </w:r>
-            <w:proofErr w:type="gramEnd"/>
-            <w:r>
-              <w:t xml:space="preserve"> (</w:t>
+              <w:t>“xx (</w:t>
             </w:r>
             <w:proofErr w:type="spellStart"/>
             <w:r>
@@ -16484,13 +16393,8 @@
     </w:p>
     <w:p>
       <w:r>
-        <w:t xml:space="preserve">Peaks over threshold extracted from 15-minute </w:t>
+        <w:t>Peaks over threshold extracted from 15-minute data</w:t>
       </w:r>
-      <w:proofErr w:type="gramStart"/>
-      <w:r>
-        <w:t>data</w:t>
-      </w:r>
-      <w:proofErr w:type="gramEnd"/>
     </w:p>
     <w:tbl>
       <w:tblPr>
@@ -17903,13 +17807,8 @@
     </w:p>
     <w:p>
       <w:r>
-        <w:t xml:space="preserve">most extreme groundwater values during key events as identified by area </w:t>
+        <w:t>most extreme groundwater values during key events as identified by area teams</w:t>
       </w:r>
-      <w:proofErr w:type="gramStart"/>
-      <w:r>
-        <w:t>teams</w:t>
-      </w:r>
-      <w:proofErr w:type="gramEnd"/>
     </w:p>
     <w:tbl>
       <w:tblPr>
@@ -19034,15 +18933,7 @@
           </w:tcPr>
           <w:p>
             <w:r>
-              <w:t>“</w:t>
-            </w:r>
-            <w:proofErr w:type="gramStart"/>
-            <w:r>
-              <w:t>xx</w:t>
-            </w:r>
-            <w:proofErr w:type="gramEnd"/>
-            <w:r>
-              <w:t xml:space="preserve"> (</w:t>
+              <w:t>“xx (</w:t>
             </w:r>
             <w:proofErr w:type="spellStart"/>
             <w:r>
@@ -19487,15 +19378,7 @@
           </w:tcPr>
           <w:p>
             <w:r>
-              <w:t>“</w:t>
-            </w:r>
-            <w:proofErr w:type="gramStart"/>
-            <w:r>
-              <w:t>xx</w:t>
-            </w:r>
-            <w:proofErr w:type="gramEnd"/>
-            <w:r>
-              <w:t xml:space="preserve"> (</w:t>
+              <w:t>“xx (</w:t>
             </w:r>
             <w:proofErr w:type="spellStart"/>
             <w:r>
@@ -19608,10 +19491,6 @@
           <w:p>
             <w:proofErr w:type="spellStart"/>
             <w:r>
-              <w:rPr>
-                <w:rFonts w:ascii="Arial" w:hAnsi="Arial" w:cs="Arial"/>
-                <w:color w:val="000000"/>
-              </w:rPr>
               <w:t>GW.Gauge</w:t>
             </w:r>
             <w:proofErr w:type="spellEnd"/>
@@ -19625,10 +19504,6 @@
           </w:tcPr>
           <w:p>
             <w:r>
-              <w:rPr>
-                <w:rFonts w:ascii="Arial" w:hAnsi="Arial" w:cs="Arial"/>
-                <w:color w:val="000000"/>
-              </w:rPr>
               <w:t>Name of groundwater gauge</w:t>
             </w:r>
           </w:p>
@@ -19657,10 +19532,6 @@
           <w:p>
             <w:proofErr w:type="spellStart"/>
             <w:r>
-              <w:rPr>
-                <w:rFonts w:ascii="Arial" w:hAnsi="Arial" w:cs="Arial"/>
-                <w:color w:val="000000"/>
-              </w:rPr>
               <w:t>por</w:t>
             </w:r>
             <w:proofErr w:type="spellEnd"/>
@@ -19674,10 +19545,6 @@
           </w:tcPr>
           <w:p>
             <w:r>
-              <w:rPr>
-                <w:rFonts w:ascii="Arial" w:hAnsi="Arial" w:cs="Arial"/>
-                <w:color w:val="000000"/>
-              </w:rPr>
               <w:t>Period of record</w:t>
             </w:r>
           </w:p>
@@ -19691,12 +19558,10 @@
               <w:t>“</w:t>
             </w:r>
             <w:proofErr w:type="spellStart"/>
-            <w:proofErr w:type="gramStart"/>
             <w:r>
               <w:t>yyyy</w:t>
             </w:r>
             <w:proofErr w:type="spellEnd"/>
-            <w:proofErr w:type="gramEnd"/>
             <w:r>
               <w:t>-zzzz” string</w:t>
             </w:r>
@@ -19716,10 +19581,6 @@
           <w:p>
             <w:proofErr w:type="spellStart"/>
             <w:r>
-              <w:rPr>
-                <w:rFonts w:ascii="Arial" w:hAnsi="Arial" w:cs="Arial"/>
-                <w:color w:val="000000"/>
-              </w:rPr>
               <w:t>reclen</w:t>
             </w:r>
             <w:proofErr w:type="spellEnd"/>
@@ -19733,10 +19594,6 @@
           </w:tcPr>
           <w:p>
             <w:r>
-              <w:rPr>
-                <w:rFonts w:ascii="Arial" w:hAnsi="Arial" w:cs="Arial"/>
-                <w:color w:val="000000"/>
-              </w:rPr>
               <w:t>Length of record (years)</w:t>
             </w:r>
           </w:p>
@@ -19764,10 +19621,6 @@
           </w:tcPr>
           <w:p>
             <w:r>
-              <w:rPr>
-                <w:rFonts w:ascii="Arial" w:hAnsi="Arial" w:cs="Arial"/>
-                <w:color w:val="000000"/>
-              </w:rPr>
               <w:t>WY</w:t>
             </w:r>
           </w:p>
@@ -19780,10 +19633,6 @@
           </w:tcPr>
           <w:p>
             <w:r>
-              <w:rPr>
-                <w:rFonts w:ascii="Arial" w:hAnsi="Arial" w:cs="Arial"/>
-                <w:color w:val="000000"/>
-              </w:rPr>
               <w:t>Water Year of AMAX1 in groundwater series</w:t>
             </w:r>
           </w:p>
@@ -19812,10 +19661,6 @@
           <w:p>
             <w:proofErr w:type="spellStart"/>
             <w:r>
-              <w:rPr>
-                <w:rFonts w:ascii="Arial" w:hAnsi="Arial" w:cs="Arial"/>
-                <w:color w:val="000000"/>
-              </w:rPr>
               <w:t>Level_AMAX</w:t>
             </w:r>
             <w:proofErr w:type="spellEnd"/>
@@ -19829,10 +19674,6 @@
           </w:tcPr>
           <w:p>
             <w:r>
-              <w:rPr>
-                <w:rFonts w:ascii="Arial" w:hAnsi="Arial" w:cs="Arial"/>
-                <w:color w:val="000000"/>
-              </w:rPr>
               <w:t>Greatest groundwater level in AMAX series (AMAX1)</w:t>
             </w:r>
           </w:p>
@@ -19863,13 +19704,8 @@
     </w:p>
     <w:p>
       <w:r>
-        <w:t xml:space="preserve">initial outline of station names, required analysis, locations and </w:t>
+        <w:t>initial outline of station names, required analysis, locations and notes</w:t>
       </w:r>
-      <w:proofErr w:type="gramStart"/>
-      <w:r>
-        <w:t>notes</w:t>
-      </w:r>
-      <w:proofErr w:type="gramEnd"/>
     </w:p>
     <w:p>
       <w:r>
@@ -20560,10 +20396,6 @@
           </w:tcPr>
           <w:p>
             <w:r>
-              <w:rPr>
-                <w:rFonts w:ascii="Arial" w:hAnsi="Arial" w:cs="Arial"/>
-                <w:color w:val="000000"/>
-              </w:rPr>
               <w:t>Area</w:t>
             </w:r>
           </w:p>
@@ -20576,10 +20408,6 @@
           </w:tcPr>
           <w:p>
             <w:r>
-              <w:rPr>
-                <w:rFonts w:ascii="Arial" w:hAnsi="Arial" w:cs="Arial"/>
-                <w:color w:val="000000"/>
-              </w:rPr>
               <w:t>EA Region</w:t>
             </w:r>
           </w:p>
@@ -20607,10 +20435,6 @@
           </w:tcPr>
           <w:p>
             <w:r>
-              <w:rPr>
-                <w:rFonts w:ascii="Arial" w:hAnsi="Arial" w:cs="Arial"/>
-                <w:color w:val="000000"/>
-              </w:rPr>
               <w:t>Gauge ID</w:t>
             </w:r>
           </w:p>
@@ -20623,10 +20447,6 @@
           </w:tcPr>
           <w:p>
             <w:r>
-              <w:rPr>
-                <w:rFonts w:ascii="Arial" w:hAnsi="Arial" w:cs="Arial"/>
-                <w:color w:val="000000"/>
-              </w:rPr>
               <w:t>Groundwater EA Gauge ID</w:t>
             </w:r>
           </w:p>
@@ -20655,10 +20475,6 @@
           <w:p>
             <w:proofErr w:type="spellStart"/>
             <w:r>
-              <w:rPr>
-                <w:rFonts w:ascii="Arial" w:hAnsi="Arial" w:cs="Arial"/>
-                <w:color w:val="000000"/>
-              </w:rPr>
               <w:t>GWGauge</w:t>
             </w:r>
             <w:proofErr w:type="spellEnd"/>
@@ -20672,10 +20488,6 @@
           </w:tcPr>
           <w:p>
             <w:r>
-              <w:rPr>
-                <w:rFonts w:ascii="Arial" w:hAnsi="Arial" w:cs="Arial"/>
-                <w:color w:val="000000"/>
-              </w:rPr>
               <w:t>Name of groundwater gauge</w:t>
             </w:r>
           </w:p>
@@ -20703,10 +20515,6 @@
           </w:tcPr>
           <w:p>
             <w:r>
-              <w:rPr>
-                <w:rFonts w:ascii="Arial" w:hAnsi="Arial" w:cs="Arial"/>
-                <w:color w:val="000000"/>
-              </w:rPr>
               <w:t>POR</w:t>
             </w:r>
           </w:p>
@@ -20719,10 +20527,6 @@
           </w:tcPr>
           <w:p>
             <w:r>
-              <w:rPr>
-                <w:rFonts w:ascii="Arial" w:hAnsi="Arial" w:cs="Arial"/>
-                <w:color w:val="000000"/>
-              </w:rPr>
               <w:t>Period of record</w:t>
             </w:r>
           </w:p>
@@ -20736,12 +20540,10 @@
               <w:t>“</w:t>
             </w:r>
             <w:proofErr w:type="spellStart"/>
-            <w:proofErr w:type="gramStart"/>
             <w:r>
               <w:t>yyyy</w:t>
             </w:r>
             <w:proofErr w:type="spellEnd"/>
-            <w:proofErr w:type="gramEnd"/>
             <w:r>
               <w:t>-zzzz” string</w:t>
             </w:r>
@@ -20761,10 +20563,6 @@
           <w:p>
             <w:proofErr w:type="spellStart"/>
             <w:r>
-              <w:rPr>
-                <w:rFonts w:ascii="Arial" w:hAnsi="Arial" w:cs="Arial"/>
-                <w:color w:val="000000"/>
-              </w:rPr>
               <w:t>reclen</w:t>
             </w:r>
             <w:proofErr w:type="spellEnd"/>
@@ -20778,10 +20576,6 @@
           </w:tcPr>
           <w:p>
             <w:r>
-              <w:rPr>
-                <w:rFonts w:ascii="Arial" w:hAnsi="Arial" w:cs="Arial"/>
-                <w:color w:val="000000"/>
-              </w:rPr>
               <w:t>Length of record (years)</w:t>
             </w:r>
           </w:p>
@@ -20810,10 +20604,6 @@
           <w:p>
             <w:proofErr w:type="spellStart"/>
             <w:r>
-              <w:rPr>
-                <w:rFonts w:ascii="Arial" w:hAnsi="Arial" w:cs="Arial"/>
-                <w:color w:val="000000"/>
-              </w:rPr>
               <w:t>MaxDay</w:t>
             </w:r>
             <w:proofErr w:type="spellEnd"/>
@@ -20827,10 +20617,6 @@
           </w:tcPr>
           <w:p>
             <w:r>
-              <w:rPr>
-                <w:rFonts w:ascii="Arial" w:hAnsi="Arial" w:cs="Arial"/>
-                <w:color w:val="000000"/>
-              </w:rPr>
               <w:t>Date of maximum groundwater depth</w:t>
             </w:r>
           </w:p>
@@ -20857,18 +20643,8 @@
             <w:vAlign w:val="bottom"/>
           </w:tcPr>
           <w:p>
-            <w:pPr>
-              <w:rPr>
-                <w:rFonts w:ascii="Arial" w:hAnsi="Arial" w:cs="Arial"/>
-                <w:color w:val="000000"/>
-              </w:rPr>
-            </w:pPr>
             <w:proofErr w:type="spellStart"/>
             <w:r>
-              <w:rPr>
-                <w:rFonts w:ascii="Arial" w:hAnsi="Arial" w:cs="Arial"/>
-                <w:color w:val="000000"/>
-              </w:rPr>
               <w:t>MaxDepth</w:t>
             </w:r>
             <w:proofErr w:type="spellEnd"/>
@@ -20881,17 +20657,7 @@
             <w:vAlign w:val="bottom"/>
           </w:tcPr>
           <w:p>
-            <w:pPr>
-              <w:rPr>
-                <w:rFonts w:ascii="Arial" w:hAnsi="Arial" w:cs="Arial"/>
-                <w:color w:val="000000"/>
-              </w:rPr>
-            </w:pPr>
-            <w:r>
-              <w:rPr>
-                <w:rFonts w:ascii="Arial" w:hAnsi="Arial" w:cs="Arial"/>
-                <w:color w:val="000000"/>
-              </w:rPr>
+            <w:r>
               <w:t>Maximum depth in groundwater depth record</w:t>
             </w:r>
           </w:p>
@@ -21045,12 +20811,10 @@
               <w:t>“</w:t>
             </w:r>
             <w:proofErr w:type="spellStart"/>
-            <w:proofErr w:type="gramStart"/>
             <w:r>
               <w:t>yyyy</w:t>
             </w:r>
             <w:proofErr w:type="spellEnd"/>
-            <w:proofErr w:type="gramEnd"/>
             <w:r>
               <w:t>-zzzz” string</w:t>
             </w:r>
@@ -21513,12 +21277,10 @@
               <w:t>“</w:t>
             </w:r>
             <w:proofErr w:type="spellStart"/>
-            <w:proofErr w:type="gramStart"/>
             <w:r>
               <w:t>yyyy</w:t>
             </w:r>
             <w:proofErr w:type="spellEnd"/>
-            <w:proofErr w:type="gramEnd"/>
             <w:r>
               <w:t>-zzzz”</w:t>
             </w:r>
@@ -22035,12 +21797,10 @@
               <w:t>“</w:t>
             </w:r>
             <w:proofErr w:type="spellStart"/>
-            <w:proofErr w:type="gramStart"/>
             <w:r>
               <w:t>yyyy</w:t>
             </w:r>
             <w:proofErr w:type="spellEnd"/>
-            <w:proofErr w:type="gramEnd"/>
             <w:r>
               <w:t>-zzzz”</w:t>
             </w:r>
@@ -22520,12 +22280,10 @@
               <w:t>“</w:t>
             </w:r>
             <w:proofErr w:type="spellStart"/>
-            <w:proofErr w:type="gramStart"/>
             <w:r>
               <w:t>yyyy</w:t>
             </w:r>
             <w:proofErr w:type="spellEnd"/>
-            <w:proofErr w:type="gramEnd"/>
             <w:r>
               <w:t>-zzzz”</w:t>
             </w:r>
@@ -22720,13 +22478,8 @@
     </w:p>
     <w:p>
       <w:r>
-        <w:t xml:space="preserve">Table for reporting joint probability analysis as obtained from JBA MEM </w:t>
+        <w:t>Table for reporting joint probability analysis as obtained from JBA MEM tool</w:t>
       </w:r>
-      <w:proofErr w:type="gramStart"/>
-      <w:r>
-        <w:t>tool</w:t>
-      </w:r>
-      <w:proofErr w:type="gramEnd"/>
     </w:p>
     <w:tbl>
       <w:tblPr>
@@ -23332,10 +23085,6 @@
           </w:tcPr>
           <w:p>
             <w:r>
-              <w:rPr>
-                <w:rFonts w:ascii="Arial" w:hAnsi="Arial" w:cs="Arial"/>
-                <w:color w:val="000000"/>
-              </w:rPr>
               <w:t>Area</w:t>
             </w:r>
           </w:p>
@@ -23348,10 +23097,6 @@
           </w:tcPr>
           <w:p>
             <w:r>
-              <w:rPr>
-                <w:rFonts w:ascii="Arial" w:hAnsi="Arial" w:cs="Arial"/>
-                <w:color w:val="000000"/>
-              </w:rPr>
               <w:t>EA Region</w:t>
             </w:r>
           </w:p>
@@ -23379,10 +23124,6 @@
           </w:tcPr>
           <w:p>
             <w:r>
-              <w:rPr>
-                <w:rFonts w:ascii="Arial" w:hAnsi="Arial" w:cs="Arial"/>
-                <w:color w:val="000000"/>
-              </w:rPr>
               <w:t>Gauge ID</w:t>
             </w:r>
           </w:p>
@@ -23395,10 +23136,6 @@
           </w:tcPr>
           <w:p>
             <w:r>
-              <w:rPr>
-                <w:rFonts w:ascii="Arial" w:hAnsi="Arial" w:cs="Arial"/>
-                <w:color w:val="000000"/>
-              </w:rPr>
               <w:t>EA WISKI ID of station</w:t>
             </w:r>
           </w:p>
@@ -23426,10 +23163,6 @@
           </w:tcPr>
           <w:p>
             <w:r>
-              <w:rPr>
-                <w:rFonts w:ascii="Arial" w:hAnsi="Arial" w:cs="Arial"/>
-                <w:color w:val="000000"/>
-              </w:rPr>
               <w:t>Length of data record</w:t>
             </w:r>
           </w:p>
@@ -23442,10 +23175,6 @@
           </w:tcPr>
           <w:p>
             <w:r>
-              <w:rPr>
-                <w:rFonts w:ascii="Arial" w:hAnsi="Arial" w:cs="Arial"/>
-                <w:color w:val="000000"/>
-              </w:rPr>
               <w:t>Length of NRFA flow data record (years)</w:t>
             </w:r>
           </w:p>
@@ -23474,10 +23203,6 @@
           <w:p>
             <w:proofErr w:type="spellStart"/>
             <w:r>
-              <w:rPr>
-                <w:rFonts w:ascii="Arial" w:hAnsi="Arial" w:cs="Arial"/>
-                <w:color w:val="000000"/>
-              </w:rPr>
               <w:t>EventDate</w:t>
             </w:r>
             <w:proofErr w:type="spellEnd"/>
@@ -23491,10 +23216,6 @@
           </w:tcPr>
           <w:p>
             <w:r>
-              <w:rPr>
-                <w:rFonts w:ascii="Arial" w:hAnsi="Arial" w:cs="Arial"/>
-                <w:color w:val="000000"/>
-              </w:rPr>
               <w:t>Date of key event as identified by local experts</w:t>
             </w:r>
           </w:p>
@@ -23523,10 +23244,6 @@
           <w:p>
             <w:proofErr w:type="spellStart"/>
             <w:r>
-              <w:rPr>
-                <w:rFonts w:ascii="Arial" w:hAnsi="Arial" w:cs="Arial"/>
-                <w:color w:val="000000"/>
-              </w:rPr>
               <w:t>EventQ</w:t>
             </w:r>
             <w:proofErr w:type="spellEnd"/>
@@ -23540,10 +23257,6 @@
           </w:tcPr>
           <w:p>
             <w:r>
-              <w:rPr>
-                <w:rFonts w:ascii="Arial" w:hAnsi="Arial" w:cs="Arial"/>
-                <w:color w:val="000000"/>
-              </w:rPr>
               <w:t>Peak flow of key event from 15-minute data (m3/s)</w:t>
             </w:r>
           </w:p>
@@ -23572,10 +23285,6 @@
           <w:p>
             <w:proofErr w:type="spellStart"/>
             <w:r>
-              <w:rPr>
-                <w:rFonts w:ascii="Arial" w:hAnsi="Arial" w:cs="Arial"/>
-                <w:color w:val="000000"/>
-              </w:rPr>
               <w:t>fit.stat</w:t>
             </w:r>
             <w:proofErr w:type="spellEnd"/>
@@ -23589,10 +23298,6 @@
           </w:tcPr>
           <w:p>
             <w:r>
-              <w:rPr>
-                <w:rFonts w:ascii="Arial" w:hAnsi="Arial" w:cs="Arial"/>
-                <w:color w:val="000000"/>
-              </w:rPr>
               <w:t>Performance statistic for stationary model</w:t>
             </w:r>
           </w:p>
@@ -23621,10 +23326,6 @@
           <w:p>
             <w:proofErr w:type="spellStart"/>
             <w:r>
-              <w:rPr>
-                <w:rFonts w:ascii="Arial" w:hAnsi="Arial" w:cs="Arial"/>
-                <w:color w:val="000000"/>
-              </w:rPr>
               <w:t>fit.var.loc</w:t>
             </w:r>
             <w:proofErr w:type="spellEnd"/>
@@ -23638,10 +23339,6 @@
           </w:tcPr>
           <w:p>
             <w:r>
-              <w:rPr>
-                <w:rFonts w:ascii="Arial" w:hAnsi="Arial" w:cs="Arial"/>
-                <w:color w:val="000000"/>
-              </w:rPr>
               <w:t>Performance statistic for nonstationary model with only location varying</w:t>
             </w:r>
           </w:p>
@@ -23670,10 +23367,6 @@
           <w:p>
             <w:proofErr w:type="spellStart"/>
             <w:r>
-              <w:rPr>
-                <w:rFonts w:ascii="Arial" w:hAnsi="Arial" w:cs="Arial"/>
-                <w:color w:val="000000"/>
-              </w:rPr>
               <w:t>fit.var.scale</w:t>
             </w:r>
             <w:proofErr w:type="spellEnd"/>
@@ -23687,10 +23380,6 @@
           </w:tcPr>
           <w:p>
             <w:r>
-              <w:rPr>
-                <w:rFonts w:ascii="Arial" w:hAnsi="Arial" w:cs="Arial"/>
-                <w:color w:val="000000"/>
-              </w:rPr>
               <w:t>Performance statistic for nonstationary model with only scale varying</w:t>
             </w:r>
           </w:p>
@@ -23719,10 +23408,6 @@
           <w:p>
             <w:proofErr w:type="spellStart"/>
             <w:r>
-              <w:rPr>
-                <w:rFonts w:ascii="Arial" w:hAnsi="Arial" w:cs="Arial"/>
-                <w:color w:val="000000"/>
-              </w:rPr>
               <w:t>fit.var.loc.scale</w:t>
             </w:r>
             <w:proofErr w:type="spellEnd"/>
@@ -23736,10 +23421,6 @@
           </w:tcPr>
           <w:p>
             <w:r>
-              <w:rPr>
-                <w:rFonts w:ascii="Arial" w:hAnsi="Arial" w:cs="Arial"/>
-                <w:color w:val="000000"/>
-              </w:rPr>
               <w:t>Performance statistic for nonstationary model with location and scale varying</w:t>
             </w:r>
           </w:p>
@@ -23767,10 +23448,6 @@
           </w:tcPr>
           <w:p>
             <w:r>
-              <w:rPr>
-                <w:rFonts w:ascii="Arial" w:hAnsi="Arial" w:cs="Arial"/>
-                <w:color w:val="000000"/>
-              </w:rPr>
               <w:t>Stationary</w:t>
             </w:r>
           </w:p>
@@ -23783,10 +23460,6 @@
           </w:tcPr>
           <w:p>
             <w:r>
-              <w:rPr>
-                <w:rFonts w:ascii="Arial" w:hAnsi="Arial" w:cs="Arial"/>
-                <w:color w:val="000000"/>
-              </w:rPr>
               <w:t>1 in x AEP for stationary model</w:t>
             </w:r>
           </w:p>
@@ -23814,10 +23487,6 @@
           </w:tcPr>
           <w:p>
             <w:r>
-              <w:rPr>
-                <w:rFonts w:ascii="Arial" w:hAnsi="Arial" w:cs="Arial"/>
-                <w:color w:val="000000"/>
-              </w:rPr>
               <w:t>Varying Location</w:t>
             </w:r>
           </w:p>
@@ -23830,10 +23499,6 @@
           </w:tcPr>
           <w:p>
             <w:r>
-              <w:rPr>
-                <w:rFonts w:ascii="Arial" w:hAnsi="Arial" w:cs="Arial"/>
-                <w:color w:val="000000"/>
-              </w:rPr>
               <w:t>1 in x AEP for nonstationary model with only location varying</w:t>
             </w:r>
           </w:p>
@@ -23861,10 +23526,6 @@
           </w:tcPr>
           <w:p>
             <w:r>
-              <w:rPr>
-                <w:rFonts w:ascii="Arial" w:hAnsi="Arial" w:cs="Arial"/>
-                <w:color w:val="000000"/>
-              </w:rPr>
               <w:t>Varying Scale</w:t>
             </w:r>
           </w:p>
@@ -23877,10 +23538,6 @@
           </w:tcPr>
           <w:p>
             <w:r>
-              <w:rPr>
-                <w:rFonts w:ascii="Arial" w:hAnsi="Arial" w:cs="Arial"/>
-                <w:color w:val="000000"/>
-              </w:rPr>
               <w:t>1 in x AEP for nonstationary model with only scale varying</w:t>
             </w:r>
           </w:p>
@@ -23909,18 +23566,10 @@
           <w:p>
             <w:proofErr w:type="spellStart"/>
             <w:r>
-              <w:rPr>
-                <w:rFonts w:ascii="Arial" w:hAnsi="Arial" w:cs="Arial"/>
-                <w:color w:val="000000"/>
-              </w:rPr>
               <w:t>Vaying</w:t>
             </w:r>
             <w:proofErr w:type="spellEnd"/>
             <w:r>
-              <w:rPr>
-                <w:rFonts w:ascii="Arial" w:hAnsi="Arial" w:cs="Arial"/>
-                <w:color w:val="000000"/>
-              </w:rPr>
               <w:t xml:space="preserve"> loc and scale</w:t>
             </w:r>
           </w:p>
@@ -23933,10 +23582,6 @@
           </w:tcPr>
           <w:p>
             <w:r>
-              <w:rPr>
-                <w:rFonts w:ascii="Arial" w:hAnsi="Arial" w:cs="Arial"/>
-                <w:color w:val="000000"/>
-              </w:rPr>
               <w:t>1 in x AEP for nonstationary model with location and scale varying</w:t>
             </w:r>
           </w:p>
@@ -23977,9 +23622,9 @@
         <w:tblLook w:val="04A0" w:firstRow="1" w:lastRow="0" w:firstColumn="1" w:lastColumn="0" w:noHBand="0" w:noVBand="1"/>
       </w:tblPr>
       <w:tblGrid>
-        <w:gridCol w:w="2044"/>
+        <w:gridCol w:w="1910"/>
         <w:gridCol w:w="5675"/>
-        <w:gridCol w:w="1909"/>
+        <w:gridCol w:w="2043"/>
       </w:tblGrid>
       <w:tr>
         <w:trPr>
@@ -24030,10 +23675,6 @@
           </w:tcPr>
           <w:p>
             <w:r>
-              <w:rPr>
-                <w:rFonts w:ascii="Arial" w:hAnsi="Arial" w:cs="Arial"/>
-                <w:color w:val="000000"/>
-              </w:rPr>
               <w:t>NRFA ID</w:t>
             </w:r>
           </w:p>
@@ -24046,10 +23687,6 @@
           </w:tcPr>
           <w:p>
             <w:r>
-              <w:rPr>
-                <w:rFonts w:ascii="Arial" w:hAnsi="Arial" w:cs="Arial"/>
-                <w:color w:val="000000"/>
-              </w:rPr>
               <w:t>NRFA station identifier</w:t>
             </w:r>
           </w:p>
@@ -24077,10 +23714,6 @@
           </w:tcPr>
           <w:p>
             <w:r>
-              <w:rPr>
-                <w:rFonts w:ascii="Arial" w:hAnsi="Arial" w:cs="Arial"/>
-                <w:color w:val="000000"/>
-              </w:rPr>
               <w:t>Area</w:t>
             </w:r>
           </w:p>
@@ -24093,10 +23726,6 @@
           </w:tcPr>
           <w:p>
             <w:r>
-              <w:rPr>
-                <w:rFonts w:ascii="Arial" w:hAnsi="Arial" w:cs="Arial"/>
-                <w:color w:val="000000"/>
-              </w:rPr>
               <w:t>EA Region</w:t>
             </w:r>
           </w:p>
@@ -24124,10 +23753,6 @@
           </w:tcPr>
           <w:p>
             <w:r>
-              <w:rPr>
-                <w:rFonts w:ascii="Arial" w:hAnsi="Arial" w:cs="Arial"/>
-                <w:color w:val="000000"/>
-              </w:rPr>
               <w:t>Gauge</w:t>
             </w:r>
           </w:p>
@@ -24140,10 +23765,6 @@
           </w:tcPr>
           <w:p>
             <w:r>
-              <w:rPr>
-                <w:rFonts w:ascii="Arial" w:hAnsi="Arial" w:cs="Arial"/>
-                <w:color w:val="000000"/>
-              </w:rPr>
               <w:t>Gauge Name</w:t>
             </w:r>
           </w:p>
@@ -24171,10 +23792,6 @@
           </w:tcPr>
           <w:p>
             <w:r>
-              <w:rPr>
-                <w:rFonts w:ascii="Arial" w:hAnsi="Arial" w:cs="Arial"/>
-                <w:color w:val="000000"/>
-              </w:rPr>
               <w:t>River</w:t>
             </w:r>
           </w:p>
@@ -24187,10 +23804,6 @@
           </w:tcPr>
           <w:p>
             <w:r>
-              <w:rPr>
-                <w:rFonts w:ascii="Arial" w:hAnsi="Arial" w:cs="Arial"/>
-                <w:color w:val="000000"/>
-              </w:rPr>
               <w:t>River on which gauge resides</w:t>
             </w:r>
           </w:p>
@@ -24218,10 +23831,6 @@
           </w:tcPr>
           <w:p>
             <w:r>
-              <w:rPr>
-                <w:rFonts w:ascii="Arial" w:hAnsi="Arial" w:cs="Arial"/>
-                <w:color w:val="000000"/>
-              </w:rPr>
               <w:t>Gauge ID</w:t>
             </w:r>
           </w:p>
@@ -24234,10 +23843,6 @@
           </w:tcPr>
           <w:p>
             <w:r>
-              <w:rPr>
-                <w:rFonts w:ascii="Arial" w:hAnsi="Arial" w:cs="Arial"/>
-                <w:color w:val="000000"/>
-              </w:rPr>
               <w:t>EA WISKI ID</w:t>
             </w:r>
           </w:p>
@@ -24266,10 +23871,6 @@
           <w:p>
             <w:proofErr w:type="spellStart"/>
             <w:r>
-              <w:rPr>
-                <w:rFonts w:ascii="Arial" w:hAnsi="Arial" w:cs="Arial"/>
-                <w:color w:val="000000"/>
-              </w:rPr>
               <w:t>EventDate</w:t>
             </w:r>
             <w:proofErr w:type="spellEnd"/>
@@ -24283,10 +23884,6 @@
           </w:tcPr>
           <w:p>
             <w:r>
-              <w:rPr>
-                <w:rFonts w:ascii="Arial" w:hAnsi="Arial" w:cs="Arial"/>
-                <w:color w:val="000000"/>
-              </w:rPr>
               <w:t>Date of key event</w:t>
             </w:r>
           </w:p>
@@ -24314,10 +23911,6 @@
           </w:tcPr>
           <w:p>
             <w:r>
-              <w:rPr>
-                <w:rFonts w:ascii="Arial" w:hAnsi="Arial" w:cs="Arial"/>
-                <w:color w:val="000000"/>
-              </w:rPr>
               <w:t>PoissonRate_1yr</w:t>
             </w:r>
           </w:p>
@@ -24330,10 +23923,6 @@
           </w:tcPr>
           <w:p>
             <w:r>
-              <w:rPr>
-                <w:rFonts w:ascii="Arial" w:hAnsi="Arial" w:cs="Arial"/>
-                <w:color w:val="000000"/>
-              </w:rPr>
               <w:t>Poisson event occurrence rate at event date (based on 1-year bandwidth)</w:t>
             </w:r>
           </w:p>
@@ -24361,10 +23950,6 @@
           </w:tcPr>
           <w:p>
             <w:r>
-              <w:rPr>
-                <w:rFonts w:ascii="Arial" w:hAnsi="Arial" w:cs="Arial"/>
-                <w:color w:val="000000"/>
-              </w:rPr>
               <w:t>Signif_1yr</w:t>
             </w:r>
           </w:p>
@@ -24377,10 +23962,6 @@
           </w:tcPr>
           <w:p>
             <w:r>
-              <w:rPr>
-                <w:rFonts w:ascii="Arial" w:hAnsi="Arial" w:cs="Arial"/>
-                <w:color w:val="000000"/>
-              </w:rPr>
               <w:t>Was this occurrence rate significant at 95% level (based on 1-year bandwidth)</w:t>
             </w:r>
           </w:p>
@@ -24408,10 +23989,6 @@
           </w:tcPr>
           <w:p>
             <w:r>
-              <w:rPr>
-                <w:rFonts w:ascii="Arial" w:hAnsi="Arial" w:cs="Arial"/>
-                <w:color w:val="000000"/>
-              </w:rPr>
               <w:t>PoissonRate_2yr</w:t>
             </w:r>
           </w:p>
@@ -24424,10 +24001,6 @@
           </w:tcPr>
           <w:p>
             <w:r>
-              <w:rPr>
-                <w:rFonts w:ascii="Arial" w:hAnsi="Arial" w:cs="Arial"/>
-                <w:color w:val="000000"/>
-              </w:rPr>
               <w:t>Poisson event occurrence rate at event date (based on 2-year bandwidth)</w:t>
             </w:r>
           </w:p>
@@ -24455,10 +24028,6 @@
           </w:tcPr>
           <w:p>
             <w:r>
-              <w:rPr>
-                <w:rFonts w:ascii="Arial" w:hAnsi="Arial" w:cs="Arial"/>
-                <w:color w:val="000000"/>
-              </w:rPr>
               <w:t>Signif_2yr</w:t>
             </w:r>
           </w:p>
@@ -24471,10 +24040,6 @@
           </w:tcPr>
           <w:p>
             <w:r>
-              <w:rPr>
-                <w:rFonts w:ascii="Arial" w:hAnsi="Arial" w:cs="Arial"/>
-                <w:color w:val="000000"/>
-              </w:rPr>
               <w:t>Was this occurrence rate significant at 95% level (based on 2-year bandwidth)</w:t>
             </w:r>
           </w:p>
@@ -24574,13 +24139,8 @@
     </w:p>
     <w:p>
       <w:r>
-        <w:t xml:space="preserve">Data relating to seasonal rainfall for specified </w:t>
+        <w:t>Data relating to seasonal rainfall for specified stations</w:t>
       </w:r>
-      <w:proofErr w:type="gramStart"/>
-      <w:r>
-        <w:t>stations</w:t>
-      </w:r>
-      <w:proofErr w:type="gramEnd"/>
     </w:p>
     <w:tbl>
       <w:tblPr>
@@ -25277,13 +24837,8 @@
     </w:p>
     <w:p>
       <w:r>
-        <w:t xml:space="preserve">Ranks and 1 in x AEP of annual maxima of N-day rainfall </w:t>
+        <w:t>Ranks and 1 in x AEP of annual maxima of N-day rainfall accumulations</w:t>
       </w:r>
-      <w:proofErr w:type="gramStart"/>
-      <w:r>
-        <w:t>accumulations</w:t>
-      </w:r>
-      <w:proofErr w:type="gramEnd"/>
     </w:p>
     <w:tbl>
       <w:tblPr>
@@ -25725,13 +25280,8 @@
     </w:p>
     <w:p>
       <w:r>
-        <w:t xml:space="preserve">N-day rainfall accumulations preceding key events, with ranks and 1-in-x </w:t>
+        <w:t>N-day rainfall accumulations preceding key events, with ranks and 1-in-x AEP</w:t>
       </w:r>
-      <w:proofErr w:type="gramStart"/>
-      <w:r>
-        <w:t>AEP</w:t>
-      </w:r>
-      <w:proofErr w:type="gramEnd"/>
     </w:p>
     <w:tbl>
       <w:tblPr>
@@ -26546,13 +26096,8 @@
     </w:p>
     <w:p>
       <w:r>
-        <w:t xml:space="preserve">All NRFA stations AMAX series, with ranks. EA WISKI ID added for WF </w:t>
+        <w:t>All NRFA stations AMAX series, with ranks. EA WISKI ID added for WF stations</w:t>
       </w:r>
-      <w:proofErr w:type="gramStart"/>
-      <w:r>
-        <w:t>stations</w:t>
-      </w:r>
-      <w:proofErr w:type="gramEnd"/>
     </w:p>
     <w:tbl>
       <w:tblPr>
@@ -27204,13 +26749,8 @@
     </w:p>
     <w:p>
       <w:r>
-        <w:t xml:space="preserve">Level AMAX series at all WF stations, full period of </w:t>
+        <w:t>Level AMAX series at all WF stations, full period of record</w:t>
       </w:r>
-      <w:proofErr w:type="gramStart"/>
-      <w:r>
-        <w:t>record</w:t>
-      </w:r>
-      <w:proofErr w:type="gramEnd"/>
     </w:p>
     <w:tbl>
       <w:tblPr>
@@ -28722,15 +28262,7 @@
           </w:tcPr>
           <w:p>
             <w:r>
-              <w:t xml:space="preserve">Was this a key event, or a </w:t>
-            </w:r>
-            <w:proofErr w:type="gramStart"/>
-            <w:r>
-              <w:t>top ranking</w:t>
-            </w:r>
-            <w:proofErr w:type="gramEnd"/>
-            <w:r>
-              <w:t xml:space="preserve"> AMAX event?</w:t>
+              <w:t>Was this a key event, or a top ranking AMAX event?</w:t>
             </w:r>
           </w:p>
         </w:tc>
@@ -28765,13 +28297,8 @@
     </w:p>
     <w:p>
       <w:r>
-        <w:t xml:space="preserve">POT series of rate-of-rise of </w:t>
+        <w:t>POT series of rate-of-rise of level</w:t>
       </w:r>
-      <w:proofErr w:type="gramStart"/>
-      <w:r>
-        <w:t>level</w:t>
-      </w:r>
-      <w:proofErr w:type="gramEnd"/>
     </w:p>
     <w:tbl>
       <w:tblPr>
@@ -28995,13 +28522,8 @@
     </w:p>
     <w:p>
       <w:r>
-        <w:t xml:space="preserve">POT series of rate-of-rise of </w:t>
+        <w:t>POT series of rate-of-rise of flow</w:t>
       </w:r>
-      <w:proofErr w:type="gramStart"/>
-      <w:r>
-        <w:t>flow</w:t>
-      </w:r>
-      <w:proofErr w:type="gramEnd"/>
     </w:p>
     <w:tbl>
       <w:tblPr>
@@ -29253,13 +28775,8 @@
     </w:p>
     <w:p>
       <w:r>
-        <w:t xml:space="preserve">simplified major river network for </w:t>
+        <w:t>simplified major river network for plotting</w:t>
       </w:r>
-      <w:proofErr w:type="gramStart"/>
-      <w:r>
-        <w:t>plotting</w:t>
-      </w:r>
-      <w:proofErr w:type="gramEnd"/>
     </w:p>
     <w:p>
       <w:pPr>
@@ -30592,13 +30109,8 @@
     </w:p>
     <w:p>
       <w:r>
-        <w:t xml:space="preserve">Reporting table of volumes associated with key </w:t>
+        <w:t>Reporting table of volumes associated with key events</w:t>
       </w:r>
-      <w:proofErr w:type="gramStart"/>
-      <w:r>
-        <w:t>events</w:t>
-      </w:r>
-      <w:proofErr w:type="gramEnd"/>
     </w:p>
     <w:tbl>
       <w:tblPr>
@@ -33539,13 +33051,14 @@
             <w:vAlign w:val="bottom"/>
           </w:tcPr>
           <w:p>
-            <w:proofErr w:type="spellStart"/>
-            <w:r>
-              <w:t>esitmated</w:t>
-            </w:r>
-            <w:proofErr w:type="spellEnd"/>
-            <w:r>
-              <w:t xml:space="preserve"> area of catchment leading to identified site</w:t>
+            <w:r>
+              <w:t>est</w:t>
+            </w:r>
+            <w:r>
+              <w:t>i</w:t>
+            </w:r>
+            <w:r>
+              <w:t>mated area of catchment leading to identified site</w:t>
             </w:r>
           </w:p>
         </w:tc>
@@ -34941,6 +34454,7 @@
   <w:style w:type="character" w:default="1" w:styleId="DefaultParagraphFont">
     <w:name w:val="Default Paragraph Font"/>
     <w:uiPriority w:val="1"/>
+    <w:semiHidden/>
     <w:unhideWhenUsed/>
   </w:style>
   <w:style w:type="table" w:default="1" w:styleId="TableNormal">

</xml_diff>